<commit_message>
Update TransferAI admin documentation and Word exports
</commit_message>
<xml_diff>
--- a/docs/transferai-admin/word/TransferAI_Africa_Admin_Guide_No1_2026-04-11.docx
+++ b/docs/transferai-admin/word/TransferAI_Africa_Admin_Guide_No1_2026-04-11.docx
@@ -637,6 +637,17 @@
           <w:sz w:val="24"/>
           <w:sz-cs w:val="24"/>
         </w:rPr>
+        <w:t xml:space="preserve">- `form_responses`</w:t>
+      </w:r>
+    </w:p>
+    <w:p>
+      <w:pPr/>
+      <w:r>
+        <w:rPr>
+          <w:rFonts w:ascii="Helvetica Light" w:hAnsi="Helvetica Light" w:cs="Helvetica Light"/>
+          <w:sz w:val="24"/>
+          <w:sz-cs w:val="24"/>
+        </w:rPr>
         <w:t xml:space="preserve">- `page_views`</w:t>
       </w:r>
     </w:p>
@@ -1308,6 +1319,17 @@
           <w:sz w:val="24"/>
           <w:sz-cs w:val="24"/>
         </w:rPr>
+        <w:t xml:space="preserve">- vérifier les demandes catalogue et leur email automatique associé</w:t>
+      </w:r>
+    </w:p>
+    <w:p>
+      <w:pPr/>
+      <w:r>
+        <w:rPr>
+          <w:rFonts w:ascii="Helvetica Light" w:hAnsi="Helvetica Light" w:cs="Helvetica Light"/>
+          <w:sz w:val="24"/>
+          <w:sz-cs w:val="24"/>
+        </w:rPr>
         <w:t xml:space="preserve">- vérifier le blog, la page entreprises, la certification et le formulaire d'audit</w:t>
       </w:r>
     </w:p>
@@ -1330,6 +1352,17 @@
           <w:sz w:val="24"/>
           <w:sz-cs w:val="24"/>
         </w:rPr>
+        <w:t xml:space="preserve">- vérifier les variantes importantes de la page contact selon les paramètres d'URL</w:t>
+      </w:r>
+    </w:p>
+    <w:p>
+      <w:pPr/>
+      <w:r>
+        <w:rPr>
+          <w:rFonts w:ascii="Helvetica Light" w:hAnsi="Helvetica Light" w:cs="Helvetica Light"/>
+          <w:sz w:val="24"/>
+          <w:sz-cs w:val="24"/>
+        </w:rPr>
         <w:t xml:space="preserve">- vérifier que le back-office charge bien</w:t>
       </w:r>
     </w:p>
@@ -2419,6 +2452,347 @@
           <w:sz w:val="24"/>
           <w:sz-cs w:val="24"/>
         </w:rPr>
+        <w:t xml:space="preserve">### F. Gestion des parcours contact</w:t>
+      </w:r>
+    </w:p>
+    <w:p>
+      <w:pPr/>
+      <w:r>
+        <w:rPr>
+          <w:rFonts w:ascii="Helvetica Light" w:hAnsi="Helvetica Light" w:cs="Helvetica Light"/>
+          <w:sz w:val="24"/>
+          <w:sz-cs w:val="24"/>
+        </w:rPr>
+        <w:t xml:space="preserve"/>
+      </w:r>
+    </w:p>
+    <w:p>
+      <w:pPr/>
+      <w:r>
+        <w:rPr>
+          <w:rFonts w:ascii="Helvetica Light" w:hAnsi="Helvetica Light" w:cs="Helvetica Light"/>
+          <w:sz w:val="24"/>
+          <w:sz-cs w:val="24"/>
+        </w:rPr>
+        <w:t xml:space="preserve">La page `Contact` n'est plus une page unique et générique. Elle sert désormais de conteneur pour plusieurs variantes de formulaires selon l'intention exprimée par le visiteur.</w:t>
+      </w:r>
+    </w:p>
+    <w:p>
+      <w:pPr/>
+      <w:r>
+        <w:rPr>
+          <w:rFonts w:ascii="Helvetica Light" w:hAnsi="Helvetica Light" w:cs="Helvetica Light"/>
+          <w:sz w:val="24"/>
+          <w:sz-cs w:val="24"/>
+        </w:rPr>
+        <w:t xml:space="preserve"/>
+      </w:r>
+    </w:p>
+    <w:p>
+      <w:pPr/>
+      <w:r>
+        <w:rPr>
+          <w:rFonts w:ascii="Helvetica Light" w:hAnsi="Helvetica Light" w:cs="Helvetica Light"/>
+          <w:sz w:val="24"/>
+          <w:sz-cs w:val="24"/>
+        </w:rPr>
+        <w:t xml:space="preserve">Les cas principaux à connaître sont :</w:t>
+      </w:r>
+    </w:p>
+    <w:p>
+      <w:pPr/>
+      <w:r>
+        <w:rPr>
+          <w:rFonts w:ascii="Helvetica Light" w:hAnsi="Helvetica Light" w:cs="Helvetica Light"/>
+          <w:sz w:val="24"/>
+          <w:sz-cs w:val="24"/>
+        </w:rPr>
+        <w:t xml:space="preserve">- `Parler à un expert IA` : porte d'entrée commerciale standard pour une demande de formation, d'accompagnement ou d'orientation</w:t>
+      </w:r>
+    </w:p>
+    <w:p>
+      <w:pPr/>
+      <w:r>
+        <w:rPr>
+          <w:rFonts w:ascii="Helvetica Light" w:hAnsi="Helvetica Light" w:cs="Helvetica Light"/>
+          <w:sz w:val="24"/>
+          <w:sz-cs w:val="24"/>
+        </w:rPr>
+        <w:t xml:space="preserve">- `demande-referencement` : variante dédiée au référencement partenaire</w:t>
+      </w:r>
+    </w:p>
+    <w:p>
+      <w:pPr/>
+      <w:r>
+        <w:rPr>
+          <w:rFonts w:ascii="Helvetica Light" w:hAnsi="Helvetica Light" w:cs="Helvetica Light"/>
+          <w:sz w:val="24"/>
+          <w:sz-cs w:val="24"/>
+        </w:rPr>
+        <w:t xml:space="preserve">- `demande-renseignement + Partenariat stratégique` : variante dédiée aux discussions de partenariat institutionnel ou stratégique</w:t>
+      </w:r>
+    </w:p>
+    <w:p>
+      <w:pPr/>
+      <w:r>
+        <w:rPr>
+          <w:rFonts w:ascii="Helvetica Light" w:hAnsi="Helvetica Light" w:cs="Helvetica Light"/>
+          <w:sz w:val="24"/>
+          <w:sz-cs w:val="24"/>
+        </w:rPr>
+        <w:t xml:space="preserve">- demande catalogue : parcours pensé pour recevoir un catalogue domaine</w:t>
+      </w:r>
+    </w:p>
+    <w:p>
+      <w:pPr/>
+      <w:r>
+        <w:rPr>
+          <w:rFonts w:ascii="Helvetica Light" w:hAnsi="Helvetica Light" w:cs="Helvetica Light"/>
+          <w:sz w:val="24"/>
+          <w:sz-cs w:val="24"/>
+        </w:rPr>
+        <w:t xml:space="preserve">- inscription formation : demande plus directe liée à une formation ou une cohorte</w:t>
+      </w:r>
+    </w:p>
+    <w:p>
+      <w:pPr/>
+      <w:r>
+        <w:rPr>
+          <w:rFonts w:ascii="Helvetica Light" w:hAnsi="Helvetica Light" w:cs="Helvetica Light"/>
+          <w:sz w:val="24"/>
+          <w:sz-cs w:val="24"/>
+        </w:rPr>
+        <w:t xml:space="preserve"/>
+      </w:r>
+    </w:p>
+    <w:p>
+      <w:pPr/>
+      <w:r>
+        <w:rPr>
+          <w:rFonts w:ascii="Helvetica Light" w:hAnsi="Helvetica Light" w:cs="Helvetica Light"/>
+          <w:sz w:val="24"/>
+          <w:sz-cs w:val="24"/>
+        </w:rPr>
+        <w:t xml:space="preserve">Bon réflexe admin :</w:t>
+      </w:r>
+    </w:p>
+    <w:p>
+      <w:pPr/>
+      <w:r>
+        <w:rPr>
+          <w:rFonts w:ascii="Helvetica Light" w:hAnsi="Helvetica Light" w:cs="Helvetica Light"/>
+          <w:sz w:val="24"/>
+          <w:sz-cs w:val="24"/>
+        </w:rPr>
+        <w:t xml:space="preserve">- vérifier les liens profonds après chaque déploiement front</w:t>
+      </w:r>
+    </w:p>
+    <w:p>
+      <w:pPr/>
+      <w:r>
+        <w:rPr>
+          <w:rFonts w:ascii="Helvetica Light" w:hAnsi="Helvetica Light" w:cs="Helvetica Light"/>
+          <w:sz w:val="24"/>
+          <w:sz-cs w:val="24"/>
+        </w:rPr>
+        <w:t xml:space="preserve">- tester la version standard ET la version paramétrée par `intent`</w:t>
+      </w:r>
+    </w:p>
+    <w:p>
+      <w:pPr/>
+      <w:r>
+        <w:rPr>
+          <w:rFonts w:ascii="Helvetica Light" w:hAnsi="Helvetica Light" w:cs="Helvetica Light"/>
+          <w:sz w:val="24"/>
+          <w:sz-cs w:val="24"/>
+        </w:rPr>
+        <w:t xml:space="preserve">- ne pas supposer qu'un lien `Contact` public affichera toujours le même formulaire</w:t>
+      </w:r>
+    </w:p>
+    <w:p>
+      <w:pPr/>
+      <w:r>
+        <w:rPr>
+          <w:rFonts w:ascii="Helvetica Light" w:hAnsi="Helvetica Light" w:cs="Helvetica Light"/>
+          <w:sz w:val="24"/>
+          <w:sz-cs w:val="24"/>
+        </w:rPr>
+        <w:t xml:space="preserve"/>
+      </w:r>
+    </w:p>
+    <w:p>
+      <w:pPr/>
+      <w:r>
+        <w:rPr>
+          <w:rFonts w:ascii="Helvetica Light" w:hAnsi="Helvetica Light" w:cs="Helvetica Light"/>
+          <w:sz w:val="24"/>
+          <w:sz-cs w:val="24"/>
+        </w:rPr>
+        <w:t xml:space="preserve">### G. Gestion des demandes catalogue</w:t>
+      </w:r>
+    </w:p>
+    <w:p>
+      <w:pPr/>
+      <w:r>
+        <w:rPr>
+          <w:rFonts w:ascii="Helvetica Light" w:hAnsi="Helvetica Light" w:cs="Helvetica Light"/>
+          <w:sz w:val="24"/>
+          <w:sz-cs w:val="24"/>
+        </w:rPr>
+        <w:t xml:space="preserve"/>
+      </w:r>
+    </w:p>
+    <w:p>
+      <w:pPr/>
+      <w:r>
+        <w:rPr>
+          <w:rFonts w:ascii="Helvetica Light" w:hAnsi="Helvetica Light" w:cs="Helvetica Light"/>
+          <w:sz w:val="24"/>
+          <w:sz-cs w:val="24"/>
+        </w:rPr>
+        <w:t xml:space="preserve">Le site gère désormais un parcours catalogue plus direct.</w:t>
+      </w:r>
+    </w:p>
+    <w:p>
+      <w:pPr/>
+      <w:r>
+        <w:rPr>
+          <w:rFonts w:ascii="Helvetica Light" w:hAnsi="Helvetica Light" w:cs="Helvetica Light"/>
+          <w:sz w:val="24"/>
+          <w:sz-cs w:val="24"/>
+        </w:rPr>
+        <w:t xml:space="preserve"/>
+      </w:r>
+    </w:p>
+    <w:p>
+      <w:pPr/>
+      <w:r>
+        <w:rPr>
+          <w:rFonts w:ascii="Helvetica Light" w:hAnsi="Helvetica Light" w:cs="Helvetica Light"/>
+          <w:sz w:val="24"/>
+          <w:sz-cs w:val="24"/>
+        </w:rPr>
+        <w:t xml:space="preserve">À retenir :</w:t>
+      </w:r>
+    </w:p>
+    <w:p>
+      <w:pPr/>
+      <w:r>
+        <w:rPr>
+          <w:rFonts w:ascii="Helvetica Light" w:hAnsi="Helvetica Light" w:cs="Helvetica Light"/>
+          <w:sz w:val="24"/>
+          <w:sz-cs w:val="24"/>
+        </w:rPr>
+        <w:t xml:space="preserve">- une demande catalogue claire peut déclencher un email enrichi avec accès immédiat au catalogue demandé</w:t>
+      </w:r>
+    </w:p>
+    <w:p>
+      <w:pPr/>
+      <w:r>
+        <w:rPr>
+          <w:rFonts w:ascii="Helvetica Light" w:hAnsi="Helvetica Light" w:cs="Helvetica Light"/>
+          <w:sz w:val="24"/>
+          <w:sz-cs w:val="24"/>
+        </w:rPr>
+        <w:t xml:space="preserve">- ce flux passe par `send-prospect-emails`</w:t>
+      </w:r>
+    </w:p>
+    <w:p>
+      <w:pPr/>
+      <w:r>
+        <w:rPr>
+          <w:rFonts w:ascii="Helvetica Light" w:hAnsi="Helvetica Light" w:cs="Helvetica Light"/>
+          <w:sz w:val="24"/>
+          <w:sz-cs w:val="24"/>
+        </w:rPr>
+        <w:t xml:space="preserve">- l'objectif n'est pas de ralentir le prospect, mais de lui donner rapidement la bonne ressource puis une suite logique</w:t>
+      </w:r>
+    </w:p>
+    <w:p>
+      <w:pPr/>
+      <w:r>
+        <w:rPr>
+          <w:rFonts w:ascii="Helvetica Light" w:hAnsi="Helvetica Light" w:cs="Helvetica Light"/>
+          <w:sz w:val="24"/>
+          <w:sz-cs w:val="24"/>
+        </w:rPr>
+        <w:t xml:space="preserve"/>
+      </w:r>
+    </w:p>
+    <w:p>
+      <w:pPr/>
+      <w:r>
+        <w:rPr>
+          <w:rFonts w:ascii="Helvetica Light" w:hAnsi="Helvetica Light" w:cs="Helvetica Light"/>
+          <w:sz w:val="24"/>
+          <w:sz-cs w:val="24"/>
+        </w:rPr>
+        <w:t xml:space="preserve">Checklist admin :</w:t>
+      </w:r>
+    </w:p>
+    <w:p>
+      <w:pPr/>
+      <w:r>
+        <w:rPr>
+          <w:rFonts w:ascii="Helvetica Light" w:hAnsi="Helvetica Light" w:cs="Helvetica Light"/>
+          <w:sz w:val="24"/>
+          <w:sz-cs w:val="24"/>
+        </w:rPr>
+        <w:t xml:space="preserve">- vérifier que le domaine demandé est bien compris</w:t>
+      </w:r>
+    </w:p>
+    <w:p>
+      <w:pPr/>
+      <w:r>
+        <w:rPr>
+          <w:rFonts w:ascii="Helvetica Light" w:hAnsi="Helvetica Light" w:cs="Helvetica Light"/>
+          <w:sz w:val="24"/>
+          <w:sz-cs w:val="24"/>
+        </w:rPr>
+        <w:t xml:space="preserve">- vérifier que l'email de réponse pointe vers le bon catalogue</w:t>
+      </w:r>
+    </w:p>
+    <w:p>
+      <w:pPr/>
+      <w:r>
+        <w:rPr>
+          <w:rFonts w:ascii="Helvetica Light" w:hAnsi="Helvetica Light" w:cs="Helvetica Light"/>
+          <w:sz w:val="24"/>
+          <w:sz-cs w:val="24"/>
+        </w:rPr>
+        <w:t xml:space="preserve">- vérifier que le CTA audit n'apparaît que s'il a du sens comme prochaine étape</w:t>
+      </w:r>
+    </w:p>
+    <w:p>
+      <w:pPr/>
+      <w:r>
+        <w:rPr>
+          <w:rFonts w:ascii="Helvetica Light" w:hAnsi="Helvetica Light" w:cs="Helvetica Light"/>
+          <w:sz w:val="24"/>
+          <w:sz-cs w:val="24"/>
+        </w:rPr>
+        <w:t xml:space="preserve">- vérifier que le ton du message reste orienté formation et non rendez-vous générique</w:t>
+      </w:r>
+    </w:p>
+    <w:p>
+      <w:pPr/>
+      <w:r>
+        <w:rPr>
+          <w:rFonts w:ascii="Helvetica Light" w:hAnsi="Helvetica Light" w:cs="Helvetica Light"/>
+          <w:sz w:val="24"/>
+          <w:sz-cs w:val="24"/>
+        </w:rPr>
+        <w:t xml:space="preserve"/>
+      </w:r>
+    </w:p>
+    <w:p>
+      <w:pPr/>
+      <w:r>
+        <w:rPr>
+          <w:rFonts w:ascii="Helvetica Light" w:hAnsi="Helvetica Light" w:cs="Helvetica Light"/>
+          <w:sz w:val="24"/>
+          <w:sz-cs w:val="24"/>
+        </w:rPr>
         <w:t xml:space="preserve">## 6. Workflow newsletter : ce qui est automatique et ce qui reste humain</w:t>
       </w:r>
     </w:p>
@@ -2804,6 +3178,28 @@
           <w:sz w:val="24"/>
           <w:sz-cs w:val="24"/>
         </w:rPr>
+        <w:t xml:space="preserve">- réponses catalogue</w:t>
+      </w:r>
+    </w:p>
+    <w:p>
+      <w:pPr/>
+      <w:r>
+        <w:rPr>
+          <w:rFonts w:ascii="Helvetica Light" w:hAnsi="Helvetica Light" w:cs="Helvetica Light"/>
+          <w:sz w:val="24"/>
+          <w:sz-cs w:val="24"/>
+        </w:rPr>
+        <w:t xml:space="preserve">- confirmations d'inscription ou de demande formation</w:t>
+      </w:r>
+    </w:p>
+    <w:p>
+      <w:pPr/>
+      <w:r>
+        <w:rPr>
+          <w:rFonts w:ascii="Helvetica Light" w:hAnsi="Helvetica Light" w:cs="Helvetica Light"/>
+          <w:sz w:val="24"/>
+          <w:sz-cs w:val="24"/>
+        </w:rPr>
         <w:t xml:space="preserve"/>
       </w:r>
     </w:p>
@@ -2859,6 +3255,138 @@
           <w:sz w:val="24"/>
           <w:sz-cs w:val="24"/>
         </w:rPr>
+        <w:t xml:space="preserve">## 7.2. Qualité attendue des emails prospects</w:t>
+      </w:r>
+    </w:p>
+    <w:p>
+      <w:pPr/>
+      <w:r>
+        <w:rPr>
+          <w:rFonts w:ascii="Helvetica Light" w:hAnsi="Helvetica Light" w:cs="Helvetica Light"/>
+          <w:sz w:val="24"/>
+          <w:sz-cs w:val="24"/>
+        </w:rPr>
+        <w:t xml:space="preserve"/>
+      </w:r>
+    </w:p>
+    <w:p>
+      <w:pPr/>
+      <w:r>
+        <w:rPr>
+          <w:rFonts w:ascii="Helvetica Light" w:hAnsi="Helvetica Light" w:cs="Helvetica Light"/>
+          <w:sz w:val="24"/>
+          <w:sz-cs w:val="24"/>
+        </w:rPr>
+        <w:t xml:space="preserve">Les emails automatiques doivent maintenant respecter une logique de clarté par cas d'usage :</w:t>
+      </w:r>
+    </w:p>
+    <w:p>
+      <w:pPr/>
+      <w:r>
+        <w:rPr>
+          <w:rFonts w:ascii="Helvetica Light" w:hAnsi="Helvetica Light" w:cs="Helvetica Light"/>
+          <w:sz w:val="24"/>
+          <w:sz-cs w:val="24"/>
+        </w:rPr>
+        <w:t xml:space="preserve">- une demande d'inscription ne doit pas afficher un lien de RDV ambigu si le besoin est déjà une candidature</w:t>
+      </w:r>
+    </w:p>
+    <w:p>
+      <w:pPr/>
+      <w:r>
+        <w:rPr>
+          <w:rFonts w:ascii="Helvetica Light" w:hAnsi="Helvetica Light" w:cs="Helvetica Light"/>
+          <w:sz w:val="24"/>
+          <w:sz-cs w:val="24"/>
+        </w:rPr>
+        <w:t xml:space="preserve">- une demande de formation doit reformuler le besoin, résumer les éléments compris et annoncer la prochaine étape utile</w:t>
+      </w:r>
+    </w:p>
+    <w:p>
+      <w:pPr/>
+      <w:r>
+        <w:rPr>
+          <w:rFonts w:ascii="Helvetica Light" w:hAnsi="Helvetica Light" w:cs="Helvetica Light"/>
+          <w:sz w:val="24"/>
+          <w:sz-cs w:val="24"/>
+        </w:rPr>
+        <w:t xml:space="preserve">- une demande catalogue doit proposer l'accès direct au bon catalogue sans détour inutile</w:t>
+      </w:r>
+    </w:p>
+    <w:p>
+      <w:pPr/>
+      <w:r>
+        <w:rPr>
+          <w:rFonts w:ascii="Helvetica Light" w:hAnsi="Helvetica Light" w:cs="Helvetica Light"/>
+          <w:sz w:val="24"/>
+          <w:sz-cs w:val="24"/>
+        </w:rPr>
+        <w:t xml:space="preserve">- une demande partenaire doit distinguer clairement référencement, visibilité ou partenariat stratégique</w:t>
+      </w:r>
+    </w:p>
+    <w:p>
+      <w:pPr/>
+      <w:r>
+        <w:rPr>
+          <w:rFonts w:ascii="Helvetica Light" w:hAnsi="Helvetica Light" w:cs="Helvetica Light"/>
+          <w:sz w:val="24"/>
+          <w:sz-cs w:val="24"/>
+        </w:rPr>
+        <w:t xml:space="preserve"/>
+      </w:r>
+    </w:p>
+    <w:p>
+      <w:pPr/>
+      <w:r>
+        <w:rPr>
+          <w:rFonts w:ascii="Helvetica Light" w:hAnsi="Helvetica Light" w:cs="Helvetica Light"/>
+          <w:sz w:val="24"/>
+          <w:sz-cs w:val="24"/>
+        </w:rPr>
+        <w:t xml:space="preserve">Règle simple :</w:t>
+      </w:r>
+    </w:p>
+    <w:p>
+      <w:pPr/>
+      <w:r>
+        <w:rPr>
+          <w:rFonts w:ascii="Helvetica Light" w:hAnsi="Helvetica Light" w:cs="Helvetica Light"/>
+          <w:sz w:val="24"/>
+          <w:sz-cs w:val="24"/>
+        </w:rPr>
+        <w:t xml:space="preserve">- ne pas injecter un CTA de rendez-vous dans un email si ce rendez-vous n'est pas la prochaine étape logique</w:t>
+      </w:r>
+    </w:p>
+    <w:p>
+      <w:pPr/>
+      <w:r>
+        <w:rPr>
+          <w:rFonts w:ascii="Helvetica Light" w:hAnsi="Helvetica Light" w:cs="Helvetica Light"/>
+          <w:sz w:val="24"/>
+          <w:sz-cs w:val="24"/>
+        </w:rPr>
+        <w:t xml:space="preserve">- ne pas mélanger devis, audit, inscription et orientation dans un même accusé de réception</w:t>
+      </w:r>
+    </w:p>
+    <w:p>
+      <w:pPr/>
+      <w:r>
+        <w:rPr>
+          <w:rFonts w:ascii="Helvetica Light" w:hAnsi="Helvetica Light" w:cs="Helvetica Light"/>
+          <w:sz w:val="24"/>
+          <w:sz-cs w:val="24"/>
+        </w:rPr>
+        <w:t xml:space="preserve"/>
+      </w:r>
+    </w:p>
+    <w:p>
+      <w:pPr/>
+      <w:r>
+        <w:rPr>
+          <w:rFonts w:ascii="Helvetica Light" w:hAnsi="Helvetica Light" w:cs="Helvetica Light"/>
+          <w:sz w:val="24"/>
+          <w:sz-cs w:val="24"/>
+        </w:rPr>
         <w:t xml:space="preserve">## 8. Secrets et accès critiques</w:t>
       </w:r>
     </w:p>
@@ -2881,6 +3409,160 @@
           <w:sz w:val="24"/>
           <w:sz-cs w:val="24"/>
         </w:rPr>
+        <w:t xml:space="preserve">## 9. Déploiement manuel utile à retenir</w:t>
+      </w:r>
+    </w:p>
+    <w:p>
+      <w:pPr/>
+      <w:r>
+        <w:rPr>
+          <w:rFonts w:ascii="Helvetica Light" w:hAnsi="Helvetica Light" w:cs="Helvetica Light"/>
+          <w:sz w:val="24"/>
+          <w:sz-cs w:val="24"/>
+        </w:rPr>
+        <w:t xml:space="preserve"/>
+      </w:r>
+    </w:p>
+    <w:p>
+      <w:pPr/>
+      <w:r>
+        <w:rPr>
+          <w:rFonts w:ascii="Helvetica Light" w:hAnsi="Helvetica Light" w:cs="Helvetica Light"/>
+          <w:sz w:val="24"/>
+          <w:sz-cs w:val="24"/>
+        </w:rPr>
+        <w:t xml:space="preserve">Quand une évolution touche la fonction `send-prospect-emails`, le point important est :</w:t>
+      </w:r>
+    </w:p>
+    <w:p>
+      <w:pPr/>
+      <w:r>
+        <w:rPr>
+          <w:rFonts w:ascii="Helvetica Light" w:hAnsi="Helvetica Light" w:cs="Helvetica Light"/>
+          <w:sz w:val="24"/>
+          <w:sz-cs w:val="24"/>
+        </w:rPr>
+        <w:t xml:space="preserve">- se placer dans le dépôt racine `connect-ia-bloom`</w:t>
+      </w:r>
+    </w:p>
+    <w:p>
+      <w:pPr/>
+      <w:r>
+        <w:rPr>
+          <w:rFonts w:ascii="Helvetica Light" w:hAnsi="Helvetica Light" w:cs="Helvetica Light"/>
+          <w:sz w:val="24"/>
+          <w:sz-cs w:val="24"/>
+        </w:rPr>
+        <w:t xml:space="preserve">- ne pas lancer la commande depuis `~` ou un autre dossier</w:t>
+      </w:r>
+    </w:p>
+    <w:p>
+      <w:pPr/>
+      <w:r>
+        <w:rPr>
+          <w:rFonts w:ascii="Helvetica Light" w:hAnsi="Helvetica Light" w:cs="Helvetica Light"/>
+          <w:sz w:val="24"/>
+          <w:sz-cs w:val="24"/>
+        </w:rPr>
+        <w:t xml:space="preserve"/>
+      </w:r>
+    </w:p>
+    <w:p>
+      <w:pPr/>
+      <w:r>
+        <w:rPr>
+          <w:rFonts w:ascii="Helvetica Light" w:hAnsi="Helvetica Light" w:cs="Helvetica Light"/>
+          <w:sz w:val="24"/>
+          <w:sz-cs w:val="24"/>
+        </w:rPr>
+        <w:t xml:space="preserve">Commande-type :</w:t>
+      </w:r>
+    </w:p>
+    <w:p>
+      <w:pPr/>
+      <w:r>
+        <w:rPr>
+          <w:rFonts w:ascii="Helvetica Light" w:hAnsi="Helvetica Light" w:cs="Helvetica Light"/>
+          <w:sz w:val="24"/>
+          <w:sz-cs w:val="24"/>
+        </w:rPr>
+        <w:t xml:space="preserve"/>
+      </w:r>
+    </w:p>
+    <w:p>
+      <w:pPr/>
+      <w:r>
+        <w:rPr>
+          <w:rFonts w:ascii="Helvetica Light" w:hAnsi="Helvetica Light" w:cs="Helvetica Light"/>
+          <w:sz w:val="24"/>
+          <w:sz-cs w:val="24"/>
+        </w:rPr>
+        <w:t xml:space="preserve">```bash</w:t>
+      </w:r>
+    </w:p>
+    <w:p>
+      <w:pPr/>
+      <w:r>
+        <w:rPr>
+          <w:rFonts w:ascii="Helvetica Light" w:hAnsi="Helvetica Light" w:cs="Helvetica Light"/>
+          <w:sz w:val="24"/>
+          <w:sz-cs w:val="24"/>
+        </w:rPr>
+        <w:t xml:space="preserve">supabase functions deploy send-prospect-emails --project-ref wlhznciwuofueffyoflo</w:t>
+      </w:r>
+    </w:p>
+    <w:p>
+      <w:pPr/>
+      <w:r>
+        <w:rPr>
+          <w:rFonts w:ascii="Helvetica Light" w:hAnsi="Helvetica Light" w:cs="Helvetica Light"/>
+          <w:sz w:val="24"/>
+          <w:sz-cs w:val="24"/>
+        </w:rPr>
+        <w:t xml:space="preserve">```</w:t>
+      </w:r>
+    </w:p>
+    <w:p>
+      <w:pPr/>
+      <w:r>
+        <w:rPr>
+          <w:rFonts w:ascii="Helvetica Light" w:hAnsi="Helvetica Light" w:cs="Helvetica Light"/>
+          <w:sz w:val="24"/>
+          <w:sz-cs w:val="24"/>
+        </w:rPr>
+        <w:t xml:space="preserve"/>
+      </w:r>
+    </w:p>
+    <w:p>
+      <w:pPr/>
+      <w:r>
+        <w:rPr>
+          <w:rFonts w:ascii="Helvetica Light" w:hAnsi="Helvetica Light" w:cs="Helvetica Light"/>
+          <w:sz w:val="24"/>
+          <w:sz-cs w:val="24"/>
+        </w:rPr>
+        <w:t xml:space="preserve">Si l'erreur mentionne `Entry path does not exist`, cela signifie généralement que la commande n'a pas été lancée depuis la racine du dépôt.</w:t>
+      </w:r>
+    </w:p>
+    <w:p>
+      <w:pPr/>
+      <w:r>
+        <w:rPr>
+          <w:rFonts w:ascii="Helvetica Light" w:hAnsi="Helvetica Light" w:cs="Helvetica Light"/>
+          <w:sz w:val="24"/>
+          <w:sz-cs w:val="24"/>
+        </w:rPr>
+        <w:t xml:space="preserve"/>
+      </w:r>
+    </w:p>
+    <w:p>
+      <w:pPr/>
+      <w:r>
+        <w:rPr>
+          <w:rFonts w:ascii="Helvetica Light" w:hAnsi="Helvetica Light" w:cs="Helvetica Light"/>
+          <w:sz w:val="24"/>
+          <w:sz-cs w:val="24"/>
+        </w:rPr>
         <w:t xml:space="preserve">### Secrets principaux</w:t>
       </w:r>
     </w:p>
@@ -4356,6 +5038,28 @@
           <w:sz-cs w:val="24"/>
         </w:rPr>
         <w:t xml:space="preserve">- logique `FR d'abord`, EN seulement pour les contenus et usages stratégiques</w:t>
+      </w:r>
+    </w:p>
+    <w:p>
+      <w:pPr/>
+      <w:r>
+        <w:rPr>
+          <w:rFonts w:ascii="Helvetica Light" w:hAnsi="Helvetica Light" w:cs="Helvetica Light"/>
+          <w:sz w:val="24"/>
+          <w:sz-cs w:val="24"/>
+        </w:rPr>
+        <w:t xml:space="preserve">- fiabilisation des parcours `Contact` avec variantes publiques plus cohérentes</w:t>
+      </w:r>
+    </w:p>
+    <w:p>
+      <w:pPr/>
+      <w:r>
+        <w:rPr>
+          <w:rFonts w:ascii="Helvetica Light" w:hAnsi="Helvetica Light" w:cs="Helvetica Light"/>
+          <w:sz w:val="24"/>
+          <w:sz-cs w:val="24"/>
+        </w:rPr>
+        <w:t xml:space="preserve">- amélioration des réponses automatiques pour les demandes de catalogue, de formation et d'inscription</w:t>
       </w:r>
     </w:p>
     <w:sectPr/>

</xml_diff>